<commit_message>
feat(dao): fournitures — arbitrage du 29/09 sur les champs non imprimes : niveaux de qualification au DPAO 6.3, variation a commande au CCAP art. 6 (B09-OM-02), telecopie PRMP retiree ; coordonnees du Fournisseur (art. 3) ne recoivent plus celles de la PRMP ; demande backend (29 champs retires pour les fournitures, recopie des modeles)
Co-Authored-By: Claude Opus 5.5 <noreply@anthropic.com>
</commit_message>
<xml_diff>
--- a/docs/modeles-dao/CCAP-F.docx
+++ b/docs/modeles-dao/CCAP-F.docx
@@ -753,19 +753,6 @@
           <w:b w:val="off"/>
           <w:sz w:val="22"/>
         </w:rPr>
-        <w:t>Télécopie : &lt;insérer le n° &gt;1</w:t>
-      </w:r>
-    </w:p>
-    <w:p>
-      <w:pPr>
-        <w:spacing w:after="120"/>
-        <w:jc w:val="both"/>
-      </w:pPr>
-      <w:r>
-        <w:rPr>
-          <w:b w:val="off"/>
-          <w:sz w:val="22"/>
-        </w:rPr>
         <w:t>Adresse électronique : {{B01-AC-06}}</w:t>
       </w:r>
     </w:p>
@@ -792,20 +779,20 @@
           <w:b w:val="off"/>
           <w:sz w:val="22"/>
         </w:rPr>
-        <w:t>A l’attention de {{B01-AC-05}}</w:t>
-      </w:r>
-    </w:p>
-    <w:p>
-      <w:pPr>
-        <w:spacing w:after="120"/>
-        <w:jc w:val="both"/>
-      </w:pPr>
-      <w:r>
-        <w:rPr>
-          <w:b w:val="off"/>
-          <w:sz w:val="22"/>
-        </w:rPr>
-        <w:t>n° et rue : {{B01-AC-02}}</w:t>
+        <w:t>A l’attention de &lt;insérer le nom&gt;</w:t>
+      </w:r>
+    </w:p>
+    <w:p>
+      <w:pPr>
+        <w:spacing w:after="120"/>
+        <w:jc w:val="both"/>
+      </w:pPr>
+      <w:r>
+        <w:rPr>
+          <w:b w:val="off"/>
+          <w:sz w:val="22"/>
+        </w:rPr>
+        <w:t>n° et rue :</w:t>
       </w:r>
     </w:p>
     <w:p>
@@ -857,7 +844,7 @@
           <w:b w:val="off"/>
           <w:sz w:val="22"/>
         </w:rPr>
-        <w:t>Adresse électronique : {{B01-AC-06}}</w:t>
+        <w:t>Adresse électronique : &lt;insérer l’adresse complète&gt;</w:t>
       </w:r>
     </w:p>
     <w:p>
@@ -1195,20 +1182,85 @@
           <w:b w:val="off"/>
           <w:sz w:val="22"/>
         </w:rPr>
-        <w:t>Le Minimum et le Maximum des quantités susceptibles d’être commandées pour chacun des articles entrant dans la composition de la fourniture sont précisés dans le Bordereau de Prix donné en Annexe à l’Acte d’Engagement, étant entendu que ces quantités sont susceptibles de varier pour chaque article dans la limite de ………..% en sus de maximum ou en dessous du minimum, sans que la valeur totale des commandes puisse être inférieure à la valeur minimale ni supérieure à la valeur maximale prévue dans le présent CPS.</w:t>
-      </w:r>
-    </w:p>
-    <w:p>
-      <w:pPr>
-        <w:spacing w:after="120"/>
-        <w:jc w:val="both"/>
-      </w:pPr>
-      <w:r>
-        <w:rPr>
-          <w:b w:val="off"/>
-          <w:sz w:val="22"/>
-        </w:rPr>
         <w:t>{{FINSI:COMMANDE}}</w:t>
+      </w:r>
+    </w:p>
+    <w:p>
+      <w:pPr>
+        <w:spacing w:after="120"/>
+        <w:jc w:val="both"/>
+      </w:pPr>
+      <w:r>
+        <w:rPr>
+          <w:b w:val="off"/>
+          <w:sz w:val="22"/>
+        </w:rPr>
+        <w:t>{{SI:VARIATION-COMMANDE}}</w:t>
+      </w:r>
+    </w:p>
+    <w:p>
+      <w:pPr>
+        <w:spacing w:after="120"/>
+        <w:jc w:val="both"/>
+      </w:pPr>
+      <w:r>
+        <w:rPr>
+          <w:b w:val="off"/>
+          <w:sz w:val="22"/>
+        </w:rPr>
+        <w:t>Le Minimum et le Maximum des quantités susceptibles d’être commandées pour chacun des articles entrant dans la composition de la fourniture sont précisés dans le Bordereau de Prix donné en Annexe à l’Acte d’Engagement, étant entendu que ces quantités sont susceptibles de varier pour chaque article dans la limite de {{B09-OM-02.chiffres}} % en sus de maximum ou en dessous du minimum, sans que la valeur totale des commandes puisse être inférieure à la valeur minimale ni supérieure à la valeur maximale prévue dans le présent CPS.</w:t>
+      </w:r>
+    </w:p>
+    <w:p>
+      <w:pPr>
+        <w:spacing w:after="120"/>
+        <w:jc w:val="both"/>
+      </w:pPr>
+      <w:r>
+        <w:rPr>
+          <w:b w:val="off"/>
+          <w:sz w:val="22"/>
+        </w:rPr>
+        <w:t>{{FINSI:VARIATION-COMMANDE}}</w:t>
+      </w:r>
+    </w:p>
+    <w:p>
+      <w:pPr>
+        <w:spacing w:after="120"/>
+        <w:jc w:val="both"/>
+      </w:pPr>
+      <w:r>
+        <w:rPr>
+          <w:b w:val="off"/>
+          <w:sz w:val="22"/>
+        </w:rPr>
+        <w:t>{{SI:SANS-VARIATION-COMMANDE}}</w:t>
+      </w:r>
+    </w:p>
+    <w:p>
+      <w:pPr>
+        <w:spacing w:after="120"/>
+        <w:jc w:val="both"/>
+      </w:pPr>
+      <w:r>
+        <w:rPr>
+          <w:b w:val="off"/>
+          <w:sz w:val="22"/>
+        </w:rPr>
+        <w:t>Le Minimum et le Maximum des quantités susceptibles d’être commandées pour chacun des articles entrant dans la composition de la fourniture sont précisés dans le Bordereau de Prix donné en Annexe à l’Acte d’Engagement.</w:t>
+      </w:r>
+    </w:p>
+    <w:p>
+      <w:pPr>
+        <w:spacing w:after="120"/>
+        <w:jc w:val="both"/>
+      </w:pPr>
+      <w:r>
+        <w:rPr>
+          <w:b w:val="off"/>
+          <w:sz w:val="22"/>
+        </w:rPr>
+        <w:t>{{FINSI:SANS-VARIATION-COMMANDE}}</w:t>
       </w:r>
     </w:p>
     <w:p>

</xml_diff>